<commit_message>
Models, Cotracts, DbContext, Events, Exceptions and Exception haldlers updated. Services and controllers updated
</commit_message>
<xml_diff>
--- a/Texts/Lab_1.docx
+++ b/Texts/Lab_1.docx
@@ -3292,6 +3292,44 @@
           <w:szCs w:val="28"/>
           <w:lang w:eastAsia="ru-RU"/>
         </w:rPr>
+        <w:t xml:space="preserve"> </w:t>
+      </w:r>
+      <w:r>
+        <w:rPr>
+          <w:rFonts w:ascii="Times New Roman" w:eastAsia="Times New Roman" w:hAnsi="Times New Roman" w:cs="Times New Roman"/>
+          <w:b/>
+          <w:bCs/>
+          <w:kern w:val="36"/>
+          <w:sz w:val="28"/>
+          <w:szCs w:val="28"/>
+          <w:lang w:val="en-US" w:eastAsia="ru-RU"/>
+        </w:rPr>
+        <w:t>(Unit</w:t>
+      </w:r>
+      <w:r>
+        <w:rPr>
+          <w:rFonts w:ascii="Times New Roman" w:eastAsia="Times New Roman" w:hAnsi="Times New Roman" w:cs="Times New Roman"/>
+          <w:b/>
+          <w:bCs/>
+          <w:kern w:val="36"/>
+          <w:sz w:val="28"/>
+          <w:szCs w:val="28"/>
+          <w:lang w:eastAsia="ru-RU"/>
+        </w:rPr>
+        <w:t>-тестирование)</w:t>
+      </w:r>
+      <w:bookmarkStart w:id="0" w:name="_GoBack"/>
+      <w:bookmarkEnd w:id="0"/>
+      <w:r>
+        <w:rPr>
+          <w:rFonts w:ascii="Times New Roman" w:eastAsia="Times New Roman" w:hAnsi="Times New Roman" w:cs="Times New Roman"/>
+          <w:b/>
+          <w:bCs/>
+          <w:kern w:val="36"/>
+          <w:sz w:val="28"/>
+          <w:szCs w:val="28"/>
+          <w:lang w:eastAsia="ru-RU"/>
+        </w:rPr>
         <w:t>.</w:t>
       </w:r>
     </w:p>
@@ -9159,8 +9197,6 @@
           <w:lang w:eastAsia="ru-RU"/>
         </w:rPr>
       </w:pPr>
-      <w:bookmarkStart w:id="0" w:name="_GoBack"/>
-      <w:bookmarkEnd w:id="0"/>
       <w:r>
         <w:rPr>
           <w:rFonts w:ascii="Times New Roman" w:eastAsia="Times New Roman" w:hAnsi="Times New Roman" w:cs="Times New Roman"/>

</xml_diff>